<commit_message>
Step 30 follow-through: GC findings on observed bus times, methodology addendum, report rev 1.2
- GC_data_inventory_and_skims.ipynb: findings rewritten for the observed
  bus running times (trunk bus GC 27.0, IVT 14.4 observed vs 10.4
  scheduled; LRT dearer by 4-31 gen-min, median 17, 18 of it access)
- METHODOLOGY.md: addendum 3 to section 6x and section 0 row updates
- reports/V2_Corridor_LRT_Times_and_GC_Inputs_Report.docx: revision 1.2
  (observed bus times, Metronit mode, step 30 section)

Co-Authored-By: Claude Fable 5.1 <noreply@anthropic.com>
Claude-Session: https://claude.ai/code/session_0138kj3xGsp2dcZMES5hKCoY
</commit_message>
<xml_diff>
--- a/reports/V2_Corridor_LRT_Times_and_GC_Inputs_Report.docx
+++ b/reports/V2_Corridor_LRT_Times_and_GC_Inputs_Report.docx
@@ -43,7 +43,7 @@
           <w:szCs w:val="26"/>
           <w:rFonts w:ascii="Calibri" w:cs="Calibri" w:eastAsia="Calibri" w:hAnsi="Calibri"/>
         </w:rPr>
-        <w:t xml:space="preserve">Findings, and what the matrices can and cannot be used for — revision 1.1</w:t>
+        <w:t xml:space="preserve">Findings, and what the matrices can and cannot be used for — revision 1.2</w:t>
       </w:r>
     </w:p>
     <w:p>
@@ -66,7 +66,7 @@
           <w:szCs w:val="22"/>
           <w:rFonts w:ascii="Calibri" w:cs="Calibri" w:eastAsia="Calibri" w:hAnsi="Calibri"/>
         </w:rPr>
-        <w:t xml:space="preserve">22 September 2026. Companion to the Survey Matrices report (revision 2.1, 21 September 2026), which remains the account of how the 2022 base was built and tested; this report covers the work done on the new inputs delivered on 22 September and states the usability of every matrix product now in the repository. Revision 1.1 (same day) corrects the LRT travel times — the calibration report’s 500 m section assumption was checked against the Red Line’s own timetable and found to halve the underground speed — and adds the bus level of service per TAZ from the national GTFS, the Metronit tagging, and the check of the bus timetable against what surveyed bus users report.</w:t>
+        <w:t xml:space="preserve">22 September 2026. Companion to the Survey Matrices report (revision 2.1, 21 September 2026), which remains the account of how the 2022 base was built and tested; this report covers the work done on the new inputs delivered on 22 September and states the usability of every matrix product now in the repository. Revision 1.1 (same day) corrects the LRT travel times — the calibration report’s 500 m section assumption was checked against the Red Line’s own timetable and found to halve the underground speed — and adds the bus level of service per TAZ from the national GTFS, the Metronit tagging, and the check of the bus timetable against what surveyed bus users report. Revision 1.2 adds the observed bus running times: every timetable trip routed over the measured May 2026 bus link speeds.</w:t>
       </w:r>
     </w:p>
     <w:p>
@@ -89,7 +89,7 @@
           <w:szCs w:val="22"/>
           <w:rFonts w:ascii="Calibri" w:cs="Calibri" w:eastAsia="Calibri" w:hAnsi="Calibri"/>
         </w:rPr>
-        <w:t xml:space="preserve">Corridor_peak_hour_V2_routes, Corridor_flow_profile_V2_routes, Corridor_profile_V2_survey_vs_ticketing, LRT_line_stations_travel_time, GTFS_bus_LOS_TAZ, GC_data_inventory_and_skims (all under notebooks/current/); THS_2017_PCA_car_vs_transit (diagnostics). Methodology sections 6s, 6v–6aa of METHODOLOGY.md.</w:t>
+        <w:t xml:space="preserve">Corridor_peak_hour_V2_routes, Corridor_flow_profile_V2_routes, Corridor_profile_V2_survey_vs_ticketing, LRT_line_stations_travel_time, GTFS_bus_LOS_TAZ, GTFS_bus_observed_times, GC_data_inventory_and_skims (all under notebooks/current/); THS_2017_PCA_car_vs_transit (diagnostics). Methodology sections 6s, 6v–6ab of METHODOLOGY.md.</w:t>
       </w:r>
     </w:p>
     <w:p>
@@ -262,7 +262,7 @@
           <w:szCs w:val="22"/>
           <w:rFonts w:ascii="Calibri" w:cs="Calibri" w:eastAsia="Calibri" w:hAnsi="Calibri"/>
         </w:rPr>
-        <w:t xml:space="preserve">A level of service for every TAZ from the national timetable — stops, lines, peak-hour departures, headway grade, direct reach — for all buses and for the Metronit lines separately, and a timetable-based in-vehicle time and headway between the 25 areas.</w:t>
+        <w:t xml:space="preserve">A level of service for every TAZ from the national timetable — stops, lines, peak-hour departures, headway grade, direct reach — for all buses and for the Metronit lines separately; a timetable-based in-vehicle time and headway between the 25 areas; and the same trips routed over the measured bus link speeds for an observed running time.</w:t>
       </w:r>
     </w:p>
     <w:p>
@@ -1025,7 +1025,7 @@
                 <w:szCs w:val="19"/>
                 <w:rFonts w:ascii="Calibri" w:cs="Calibri" w:eastAsia="Calibri" w:hAnsi="Calibri"/>
               </w:rPr>
-              <w:t xml:space="preserve">Generalized-cost first fill, trunk pairs, trip-weighted</w:t>
+              <w:t xml:space="preserve">Observed bus running time (trips routed over the measured link speeds) against the timetable</w:t>
             </w:r>
           </w:p>
         </w:tc>
@@ -1051,7 +1051,7 @@
                 <w:szCs w:val="19"/>
                 <w:rFonts w:ascii="Calibri" w:cs="Calibri" w:eastAsia="Calibri" w:hAnsi="Calibri"/>
               </w:rPr>
-              <w:t xml:space="preserve">Car door-to-door 14.5 min. Bus from the timetable: in-vehicle 12.3, walk 4.7, wait 1.6 min (partial cost 24.9). LRT: in-vehicle 11.7 (underground) / 18.9 (ground) min, walk 13.6, wait 2.5 at a 5-minute headway (partial cost 43.9 / 51.1)</w:t>
+              <w:t xml:space="preserve">Per trip 1.09 × (Metronit 0.87); hops under 500 m on schedule, hops over 2 km 1.4 × slower; trunk pairs 14.4 min observed against 10.4 scheduled, demand-weighted</w:t>
             </w:r>
           </w:p>
         </w:tc>
@@ -1079,7 +1079,7 @@
                 <w:szCs w:val="19"/>
                 <w:rFonts w:ascii="Calibri" w:cs="Calibri" w:eastAsia="Calibri" w:hAnsi="Calibri"/>
               </w:rPr>
-              <w:t xml:space="preserve">Bus timetable against the survey, same pairs</w:t>
+              <w:t xml:space="preserve">Generalized-cost first fill, trunk pairs, trip-weighted</w:t>
             </w:r>
           </w:p>
         </w:tc>
@@ -1105,7 +1105,61 @@
                 <w:szCs w:val="19"/>
                 <w:rFonts w:ascii="Calibri" w:cs="Calibri" w:eastAsia="Calibri" w:hAnsi="Calibri"/>
               </w:rPr>
-              <w:t xml:space="preserve">Timetable door-to-door 23.0 min against 31.8 reported (× 1.4): a fixed overhead of about 9 minutes, 1.9 × on pairs under 3 km, 1.3 × at 3–20 km, 0.9 × beyond</w:t>
+              <w:t xml:space="preserve">Car door-to-door 14.5 min. Bus, observed: in-vehicle 14.4, walk 4.7, wait 1.6 min (partial cost 27.0). LRT: in-vehicle 11.7 (underground) / 18.9 (ground) min, walk 13.6, wait 2.5 at a 5-minute headway (partial cost 43.9 / 51.1)</w:t>
+            </w:r>
+          </w:p>
+        </w:tc>
+      </w:tr>
+      <w:tr>
+        <w:tc>
+          <w:tcPr>
+            <w:tcW w:type="dxa" w:w="2880"/>
+            <w:tcMar>
+              <w:top w:type="dxa" w:w="40"/>
+              <w:left w:type="dxa" w:w="80"/>
+              <w:bottom w:type="dxa" w:w="40"/>
+              <w:right w:type="dxa" w:w="80"/>
+            </w:tcMar>
+          </w:tcPr>
+          <w:p>
+            <w:pPr>
+              <w:spacing w:after="0"/>
+            </w:pPr>
+            <w:r>
+              <w:rPr>
+                <w:b w:val="false"/>
+                <w:bCs w:val="false"/>
+                <w:sz w:val="19"/>
+                <w:szCs w:val="19"/>
+                <w:rFonts w:ascii="Calibri" w:cs="Calibri" w:eastAsia="Calibri" w:hAnsi="Calibri"/>
+              </w:rPr>
+              <w:t xml:space="preserve">GTFS-based bus door-to-door against the survey, same pairs</w:t>
+            </w:r>
+          </w:p>
+        </w:tc>
+        <w:tc>
+          <w:tcPr>
+            <w:tcW w:type="dxa" w:w="6120"/>
+            <w:tcMar>
+              <w:top w:type="dxa" w:w="40"/>
+              <w:left w:type="dxa" w:w="80"/>
+              <w:bottom w:type="dxa" w:w="40"/>
+              <w:right w:type="dxa" w:w="80"/>
+            </w:tcMar>
+          </w:tcPr>
+          <w:p>
+            <w:pPr>
+              <w:spacing w:after="0"/>
+            </w:pPr>
+            <w:r>
+              <w:rPr>
+                <w:b w:val="false"/>
+                <w:bCs w:val="false"/>
+                <w:sz w:val="19"/>
+                <w:szCs w:val="19"/>
+                <w:rFonts w:ascii="Calibri" w:cs="Calibri" w:eastAsia="Calibri" w:hAnsi="Calibri"/>
+              </w:rPr>
+              <w:t xml:space="preserve">24.3 min against 31.8 reported (× 1.3): a fixed overhead of about 7 minutes, 1.9 × on pairs under 3 km, 1.1–1.5 × at 3–20 km, parity beyond</w:t>
             </w:r>
           </w:p>
         </w:tc>
@@ -1285,7 +1339,7 @@
           <w:szCs w:val="22"/>
           <w:rFonts w:ascii="Calibri" w:cs="Calibri" w:eastAsia="Calibri" w:hAnsi="Calibri"/>
         </w:rPr>
-        <w:t xml:space="preserve">With the corrected function the LRT is as fast as the bus in the vehicle; what it loses on is station access. </w:t>
+        <w:t xml:space="preserve">The buses run slower than their timetable where the demand is, and the LRT would be faster in the vehicle. </w:t>
       </w:r>
       <w:r>
         <w:rPr>
@@ -1293,7 +1347,7 @@
           <w:szCs w:val="22"/>
           <w:rFonts w:ascii="Calibri" w:cs="Calibri" w:eastAsia="Calibri" w:hAnsi="Calibri"/>
         </w:rPr>
-        <w:t xml:space="preserve">On the trunk pairs the LRT in-vehicle time is 11.7 minutes underground against 12.3 for the timetable’s best direct bus. But 24 stations against 12,845 stops means 13.6 minutes of walking against 4.7, and with walking weighted twice the LRT’s partial generalized cost (43.9 underground, 51.1 at ground level, with a 5-minute headway) is above the bus’s 24.9 on every trunk pair. Door to door the underground LRT (28 min) equals what bus users report today (27 min). The open question on the LRT side is no longer its speed but its access: feeder buses, the walking network and park-and-ride.</w:t>
+        <w:t xml:space="preserve">Every morning-peak timetable trip was routed stop by stop over the measured bus link speeds. Short hops match the schedule to the minute, so the link speeds include the dwell at stops; hops over a kilometre — the arterial stretches — run 1.25 to 1.4 times slower than scheduled in the 07:00–08:00 hour, and the Metronit runs faster than its timetable (0.87). Demand-weighted on the trunk pairs the observed bus in-vehicle time is 14.4 minutes against 10.4 scheduled, and the underground LRT’s 11.7 minutes is now three minutes below it.</w:t>
       </w:r>
     </w:p>
     <w:p>
@@ -1313,7 +1367,7 @@
           <w:szCs w:val="22"/>
           <w:rFonts w:ascii="Calibri" w:cs="Calibri" w:eastAsia="Calibri" w:hAnsi="Calibri"/>
         </w:rPr>
-        <w:t xml:space="preserve">The bus timetable promises less time than bus users report, by a fixed nine minutes. </w:t>
+        <w:t xml:space="preserve">What the LRT loses on is station access. </w:t>
       </w:r>
       <w:r>
         <w:rPr>
@@ -1321,7 +1375,35 @@
           <w:szCs w:val="22"/>
           <w:rFonts w:ascii="Calibri" w:cs="Calibri" w:eastAsia="Calibri" w:hAnsi="Calibri"/>
         </w:rPr>
-        <w:t xml:space="preserve">On the same area pairs the timetable’s best direct service — in-vehicle plus walk to the nearest stop plus half the pooled headway — gives 23 minutes door to door; surveyed bus users report 32. The ratio is 1.9 on pairs under 3 km and shrinks to 1.3 at 3–20 km and to parity beyond, so it is an overhead (the transfer, the wait for the line actually needed, delay), not a speed error. It is the calibration margin for the bus generalized cost.</w:t>
+        <w:t xml:space="preserve">24 stations against 12,845 stops means 13.6 minutes of walking against 4.7, and with walking weighted twice the LRT’s partial generalized cost (43.9 underground, 51.1 at ground level, with a 5-minute headway) is above the bus’s 27.0 on every trunk pair. Door to door the underground LRT (28 min) equals what bus users report today (27 min). The open question on the LRT side is no longer its speed but its access: feeder buses, the walking network and park-and-ride.</w:t>
+      </w:r>
+    </w:p>
+    <w:p>
+      <w:pPr>
+        <w:pStyle w:val="ListParagraph"/>
+        <w:numPr>
+          <w:ilvl w:val="0"/>
+          <w:numId w:val="2"/>
+        </w:numPr>
+        <w:spacing w:after="80"/>
+      </w:pPr>
+      <w:r>
+        <w:rPr>
+          <w:b/>
+          <w:bCs/>
+          <w:sz w:val="22"/>
+          <w:szCs w:val="22"/>
+          <w:rFonts w:ascii="Calibri" w:cs="Calibri" w:eastAsia="Calibri" w:hAnsi="Calibri"/>
+        </w:rPr>
+        <w:t xml:space="preserve">The GTFS-based door-to-door time is below what bus users report, by a fixed seven minutes. </w:t>
+      </w:r>
+      <w:r>
+        <w:rPr>
+          <w:sz w:val="22"/>
+          <w:szCs w:val="22"/>
+          <w:rFonts w:ascii="Calibri" w:cs="Calibri" w:eastAsia="Calibri" w:hAnsi="Calibri"/>
+        </w:rPr>
+        <w:t xml:space="preserve">On the same area pairs the best direct service — observed in-vehicle time plus walk to the nearest stop plus half the pooled headway — gives 24 minutes door to door; surveyed bus users report 32. The ratio is 1.9 on pairs under 3 km and shrinks towards parity beyond 20 km, so it is an overhead (the transfer, the wait for the line actually needed), not a speed error: the running time itself is now observed. It is the calibration margin for the bus generalized cost.</w:t>
       </w:r>
     </w:p>
     <w:p>
@@ -7761,7 +7843,7 @@
                 <w:szCs w:val="17"/>
                 <w:rFonts w:ascii="Calibri" w:cs="Calibri" w:eastAsia="Calibri" w:hAnsi="Calibri"/>
               </w:rPr>
-              <w:t xml:space="preserve">Derived: scheduled time of the direct services in the GTFS on the 422 of 600 pairs that have one (82 of 90 trunk pairs); elsewhere the fastest path on the May 2026 speed network scaled by 1.12, the median timetable-to-floor ratio</w:t>
+              <w:t xml:space="preserve">Derived: observed running time of the direct GTFS services routed over the measured link speeds, on the 422 of 600 pairs that have one (82 of 90 trunk pairs); the scheduled time kept alongside; elsewhere the fastest path on the speed network scaled by 1.12</w:t>
             </w:r>
           </w:p>
         </w:tc>
@@ -8825,7 +8907,7 @@
                 <w:szCs w:val="17"/>
                 <w:rFonts w:ascii="Calibri" w:cs="Calibri" w:eastAsia="Calibri" w:hAnsi="Calibri"/>
               </w:rPr>
-              <w:t xml:space="preserve">Bus (timetable)</w:t>
+              <w:t xml:space="preserve">Bus (observed running time)</w:t>
             </w:r>
           </w:p>
         </w:tc>
@@ -8851,7 +8933,7 @@
                 <w:szCs w:val="17"/>
                 <w:rFonts w:ascii="Calibri" w:cs="Calibri" w:eastAsia="Calibri" w:hAnsi="Calibri"/>
               </w:rPr>
-              <w:t xml:space="preserve">12.3 min (direct services; the speed-network floor was 12.5)</w:t>
+              <w:t xml:space="preserve">14.4 min (direct services over the measured link speeds; the timetable says 10.4, the speed-network floor 12.5)</w:t>
             </w:r>
           </w:p>
         </w:tc>
@@ -8929,7 +9011,7 @@
                 <w:szCs w:val="17"/>
                 <w:rFonts w:ascii="Calibri" w:cs="Calibri" w:eastAsia="Calibri" w:hAnsi="Calibri"/>
               </w:rPr>
-              <w:t xml:space="preserve">24.9</w:t>
+              <w:t xml:space="preserve">27.0</w:t>
             </w:r>
           </w:p>
         </w:tc>
@@ -9009,7 +9091,7 @@
                 <w:szCs w:val="17"/>
                 <w:rFonts w:ascii="Calibri" w:cs="Calibri" w:eastAsia="Calibri" w:hAnsi="Calibri"/>
               </w:rPr>
-              <w:t xml:space="preserve">7.8 min</w:t>
+              <w:t xml:space="preserve">8.6 min (scheduled 7.8)</w:t>
             </w:r>
           </w:p>
         </w:tc>
@@ -9087,7 +9169,7 @@
                 <w:szCs w:val="17"/>
                 <w:rFonts w:ascii="Calibri" w:cs="Calibri" w:eastAsia="Calibri" w:hAnsi="Calibri"/>
               </w:rPr>
-              <w:t xml:space="preserve">21.2</w:t>
+              <w:t xml:space="preserve">22.1</w:t>
             </w:r>
           </w:p>
         </w:tc>
@@ -9113,7 +9195,7 @@
                 <w:szCs w:val="17"/>
                 <w:rFonts w:ascii="Calibri" w:cs="Calibri" w:eastAsia="Calibri" w:hAnsi="Calibri"/>
               </w:rPr>
-              <w:t xml:space="preserve">Level with all-bus on the same pairs (20.0), which already includes it</w:t>
+              <w:t xml:space="preserve">Level with all-bus on the same pairs (20.2), which already includes it</w:t>
             </w:r>
           </w:p>
         </w:tc>
@@ -9271,7 +9353,7 @@
                 <w:szCs w:val="17"/>
                 <w:rFonts w:ascii="Calibri" w:cs="Calibri" w:eastAsia="Calibri" w:hAnsi="Calibri"/>
               </w:rPr>
-              <w:t xml:space="preserve">Dearer than the bus on every trunk pair, by 7–31 (median 17)</w:t>
+              <w:t xml:space="preserve">Dearer than the bus on every trunk pair, by 4–31 (median 17)</w:t>
             </w:r>
           </w:p>
         </w:tc>
@@ -9535,7 +9617,7 @@
         <w:rPr>
           <w:rFonts w:ascii="Calibri" w:cs="Calibri" w:eastAsia="Calibri" w:hAnsi="Calibri"/>
         </w:rPr>
-        <w:t xml:space="preserve">5.3 The bus timetable against what bus users report</w:t>
+        <w:t xml:space="preserve">5.3 Observed running times, and the bus against what bus users report</w:t>
       </w:r>
     </w:p>
     <w:p>
@@ -9548,7 +9630,83 @@
           <w:szCs w:val="22"/>
           <w:rFonts w:ascii="Calibri" w:cs="Calibri" w:eastAsia="Calibri" w:hAnsi="Calibri"/>
         </w:rPr>
-        <w:t xml:space="preserve">The surveyed bus trips of 2b were compared, pair by pair, with the timetable’s door-to-door time for their area pair: direct in-vehicle time plus walking to the nearest served stop plus half the pooled headway. On the pairs with a direct service, which carry 97 % of the surveyed bus trips, the timetable gives 23.0 minutes (in-vehicle 15.8, walk 5.3, wait 1.9) against 31.8 reported. The ratio is not constant:</w:t>
+        <w:t xml:space="preserve">Every morning-peak timetable trip was routed, stop by stop, over the street network with the measured May 2026 bus link speeds (weekday 3, 07:00–08:00): 7,324 trips, 15,929 distinct stop-to-stop segments routed once each by shortest path, 94 % of the routed length on links with a measured speed, 2 % of segments falling back to the schedule. Per trip the observed in-vehicle time is 1.09 times the scheduled one (Metronit 0.87, ordinary buses 1.10). The pattern by hop length says what the speeds contain: hops under 500 m, two thirds of all hops, take exactly the scheduled time, so the link speeds include the dwell at stops; hops of 1–2 km run 1.25 times slower than scheduled and hops over 2 km 1.4 times, which is the peak-hour congestion on the arterials that the timetable pads only partly. Demand-weighted on the trunk pairs the observed in-vehicle time is 14.4 minutes against 10.4 scheduled. The long interurban timetables are padded (observed 0.88 of schedule on pairs over 30 scheduled minutes), except from Nazareth, where the observed times to the Haifa trunk run 8–9 minutes above the schedule.</w:t>
+      </w:r>
+    </w:p>
+    <w:p>
+      <w:pPr>
+        <w:spacing w:before="120" w:after="60"/>
+        <w:jc w:val="center"/>
+      </w:pPr>
+      <w:r>
+        <w:drawing>
+          <wp:inline distT="0" distB="0" distL="0" distR="0">
+            <wp:extent cx="5810250" cy="2714625"/>
+            <wp:effectExtent t="0" r="0" b="0" l="0"/>
+            <wp:docPr id="1" name="" descr="" title=""/>
+            <wp:cNvGraphicFramePr>
+              <a:graphicFrameLocks xmlns:a="http://schemas.openxmlformats.org/drawingml/2006/main" noChangeAspect="1"/>
+            </wp:cNvGraphicFramePr>
+            <a:graphic xmlns:a="http://schemas.openxmlformats.org/drawingml/2006/main">
+              <a:graphicData uri="http://schemas.openxmlformats.org/drawingml/2006/picture">
+                <pic:pic xmlns:pic="http://schemas.openxmlformats.org/drawingml/2006/picture">
+                  <pic:nvPicPr>
+                    <pic:cNvPr id="0" name="" descr=""/>
+                    <pic:cNvPicPr>
+                      <a:picLocks noChangeAspect="1" noChangeArrowheads="1"/>
+                    </pic:cNvPicPr>
+                  </pic:nvPicPr>
+                  <pic:blipFill>
+                    <a:blip r:embed="rId12" cstate="none"/>
+                    <a:srcRect/>
+                    <a:stretch>
+                      <a:fillRect/>
+                    </a:stretch>
+                  </pic:blipFill>
+                  <pic:spPr bwMode="auto">
+                    <a:xfrm>
+                      <a:off x="0" y="0"/>
+                      <a:ext cx="5810250" cy="2714625"/>
+                    </a:xfrm>
+                    <a:prstGeom prst="rect">
+                      <a:avLst/>
+                    </a:prstGeom>
+                  </pic:spPr>
+                </pic:pic>
+              </a:graphicData>
+            </a:graphic>
+          </wp:inline>
+        </w:drawing>
+      </w:r>
+    </w:p>
+    <w:p>
+      <w:pPr>
+        <w:spacing w:after="240"/>
+        <w:jc w:val="center"/>
+      </w:pPr>
+      <w:r>
+        <w:rPr>
+          <w:i/>
+          <w:iCs/>
+          <w:color w:val="52514E"/>
+          <w:sz w:val="18"/>
+          <w:szCs w:val="18"/>
+          <w:rFonts w:ascii="Calibri" w:cs="Calibri" w:eastAsia="Calibri" w:hAnsi="Calibri"/>
+        </w:rPr>
+        <w:t xml:space="preserve">Figure 6. Observed against scheduled bus in-vehicle time per area pair (left) and the observed-to-scheduled ratio by hop length with the measured-link coverage (right).</w:t>
+      </w:r>
+    </w:p>
+    <w:p>
+      <w:pPr>
+        <w:spacing w:after="120" w:before="0"/>
+      </w:pPr>
+      <w:r>
+        <w:rPr>
+          <w:sz w:val="22"/>
+          <w:szCs w:val="22"/>
+          <w:rFonts w:ascii="Calibri" w:cs="Calibri" w:eastAsia="Calibri" w:hAnsi="Calibri"/>
+        </w:rPr>
+        <w:t xml:space="preserve">The surveyed bus trips of 2b were then compared, pair by pair, with the GTFS-based door-to-door time for their area pair: observed in-vehicle time plus walking to the nearest served stop plus half the pooled headway. On the pairs with a direct service, which carry 97 % of the surveyed bus trips, this gives 24.3 minutes (in-vehicle 17.1, walk 5.3, wait 1.9) against 31.8 reported. The ratio is not constant:</w:t>
       </w:r>
     </w:p>
     <w:tbl>
@@ -9679,7 +9837,7 @@
                 <w:szCs w:val="18"/>
                 <w:rFonts w:ascii="Calibri" w:cs="Calibri" w:eastAsia="Calibri" w:hAnsi="Calibri"/>
               </w:rPr>
-              <w:t xml:space="preserve">Timetable in-vehicle (min)</w:t>
+              <w:t xml:space="preserve">GTFS observed in-vehicle (min)</w:t>
             </w:r>
           </w:p>
         </w:tc>
@@ -9706,7 +9864,7 @@
                 <w:szCs w:val="18"/>
                 <w:rFonts w:ascii="Calibri" w:cs="Calibri" w:eastAsia="Calibri" w:hAnsi="Calibri"/>
               </w:rPr>
-              <w:t xml:space="preserve">Timetable door-to-door (min)</w:t>
+              <w:t xml:space="preserve">GTFS door-to-door (min)</w:t>
             </w:r>
           </w:p>
         </w:tc>
@@ -9733,7 +9891,7 @@
                 <w:szCs w:val="18"/>
                 <w:rFonts w:ascii="Calibri" w:cs="Calibri" w:eastAsia="Calibri" w:hAnsi="Calibri"/>
               </w:rPr>
-              <w:t xml:space="preserve">Survey ÷ timetable</w:t>
+              <w:t xml:space="preserve">Survey ÷ GTFS</w:t>
             </w:r>
           </w:p>
         </w:tc>
@@ -9839,7 +9997,7 @@
                 <w:szCs w:val="18"/>
                 <w:rFonts w:ascii="Calibri" w:cs="Calibri" w:eastAsia="Calibri" w:hAnsi="Calibri"/>
               </w:rPr>
-              <w:t xml:space="preserve">15.8</w:t>
+              <w:t xml:space="preserve">17.1</w:t>
             </w:r>
           </w:p>
         </w:tc>
@@ -9865,7 +10023,7 @@
                 <w:szCs w:val="18"/>
                 <w:rFonts w:ascii="Calibri" w:cs="Calibri" w:eastAsia="Calibri" w:hAnsi="Calibri"/>
               </w:rPr>
-              <w:t xml:space="preserve">23.0</w:t>
+              <w:t xml:space="preserve">24.3</w:t>
             </w:r>
           </w:p>
         </w:tc>
@@ -9891,7 +10049,7 @@
                 <w:szCs w:val="18"/>
                 <w:rFonts w:ascii="Calibri" w:cs="Calibri" w:eastAsia="Calibri" w:hAnsi="Calibri"/>
               </w:rPr>
-              <w:t xml:space="preserve">1.4</w:t>
+              <w:t xml:space="preserve">1.3</w:t>
             </w:r>
           </w:p>
         </w:tc>
@@ -9997,7 +10155,7 @@
                 <w:szCs w:val="18"/>
                 <w:rFonts w:ascii="Calibri" w:cs="Calibri" w:eastAsia="Calibri" w:hAnsi="Calibri"/>
               </w:rPr>
-              <w:t xml:space="preserve">11.5</w:t>
+              <w:t xml:space="preserve">14.1</w:t>
             </w:r>
           </w:p>
         </w:tc>
@@ -10023,7 +10181,7 @@
                 <w:szCs w:val="18"/>
                 <w:rFonts w:ascii="Calibri" w:cs="Calibri" w:eastAsia="Calibri" w:hAnsi="Calibri"/>
               </w:rPr>
-              <w:t xml:space="preserve">17.4</w:t>
+              <w:t xml:space="preserve">20.0</w:t>
             </w:r>
           </w:p>
         </w:tc>
@@ -10049,7 +10207,7 @@
                 <w:szCs w:val="18"/>
                 <w:rFonts w:ascii="Calibri" w:cs="Calibri" w:eastAsia="Calibri" w:hAnsi="Calibri"/>
               </w:rPr>
-              <w:t xml:space="preserve">1.5</w:t>
+              <w:t xml:space="preserve">1.3</w:t>
             </w:r>
           </w:p>
         </w:tc>
@@ -10155,7 +10313,7 @@
                 <w:szCs w:val="18"/>
                 <w:rFonts w:ascii="Calibri" w:cs="Calibri" w:eastAsia="Calibri" w:hAnsi="Calibri"/>
               </w:rPr>
-              <w:t xml:space="preserve">7.7</w:t>
+              <w:t xml:space="preserve">7.8</w:t>
             </w:r>
           </w:p>
         </w:tc>
@@ -10181,7 +10339,7 @@
                 <w:szCs w:val="18"/>
                 <w:rFonts w:ascii="Calibri" w:cs="Calibri" w:eastAsia="Calibri" w:hAnsi="Calibri"/>
               </w:rPr>
-              <w:t xml:space="preserve">13.5</w:t>
+              <w:t xml:space="preserve">13.7</w:t>
             </w:r>
           </w:p>
         </w:tc>
@@ -10313,7 +10471,7 @@
                 <w:szCs w:val="18"/>
                 <w:rFonts w:ascii="Calibri" w:cs="Calibri" w:eastAsia="Calibri" w:hAnsi="Calibri"/>
               </w:rPr>
-              <w:t xml:space="preserve">15.6</w:t>
+              <w:t xml:space="preserve">18.7</w:t>
             </w:r>
           </w:p>
         </w:tc>
@@ -10339,7 +10497,7 @@
                 <w:szCs w:val="18"/>
                 <w:rFonts w:ascii="Calibri" w:cs="Calibri" w:eastAsia="Calibri" w:hAnsi="Calibri"/>
               </w:rPr>
-              <w:t xml:space="preserve">22.5</w:t>
+              <w:t xml:space="preserve">25.6</w:t>
             </w:r>
           </w:p>
         </w:tc>
@@ -10365,7 +10523,7 @@
                 <w:szCs w:val="18"/>
                 <w:rFonts w:ascii="Calibri" w:cs="Calibri" w:eastAsia="Calibri" w:hAnsi="Calibri"/>
               </w:rPr>
-              <w:t xml:space="preserve">1.3</w:t>
+              <w:t xml:space="preserve">1.1</w:t>
             </w:r>
           </w:p>
         </w:tc>
@@ -10471,7 +10629,7 @@
                 <w:szCs w:val="18"/>
                 <w:rFonts w:ascii="Calibri" w:cs="Calibri" w:eastAsia="Calibri" w:hAnsi="Calibri"/>
               </w:rPr>
-              <w:t xml:space="preserve">29.0</w:t>
+              <w:t xml:space="preserve">27.3</w:t>
             </w:r>
           </w:p>
         </w:tc>
@@ -10497,7 +10655,7 @@
                 <w:szCs w:val="18"/>
                 <w:rFonts w:ascii="Calibri" w:cs="Calibri" w:eastAsia="Calibri" w:hAnsi="Calibri"/>
               </w:rPr>
-              <w:t xml:space="preserve">38.5</w:t>
+              <w:t xml:space="preserve">36.9</w:t>
             </w:r>
           </w:p>
         </w:tc>
@@ -10523,7 +10681,7 @@
                 <w:szCs w:val="18"/>
                 <w:rFonts w:ascii="Calibri" w:cs="Calibri" w:eastAsia="Calibri" w:hAnsi="Calibri"/>
               </w:rPr>
-              <w:t xml:space="preserve">1.3</w:t>
+              <w:t xml:space="preserve">1.4</w:t>
             </w:r>
           </w:p>
         </w:tc>
@@ -10629,7 +10787,7 @@
                 <w:szCs w:val="18"/>
                 <w:rFonts w:ascii="Calibri" w:cs="Calibri" w:eastAsia="Calibri" w:hAnsi="Calibri"/>
               </w:rPr>
-              <w:t xml:space="preserve">48.4</w:t>
+              <w:t xml:space="preserve">55.9</w:t>
             </w:r>
           </w:p>
         </w:tc>
@@ -10655,7 +10813,7 @@
                 <w:szCs w:val="18"/>
                 <w:rFonts w:ascii="Calibri" w:cs="Calibri" w:eastAsia="Calibri" w:hAnsi="Calibri"/>
               </w:rPr>
-              <w:t xml:space="preserve">62.9</w:t>
+              <w:t xml:space="preserve">70.4</w:t>
             </w:r>
           </w:p>
         </w:tc>
@@ -10681,7 +10839,7 @@
                 <w:szCs w:val="18"/>
                 <w:rFonts w:ascii="Calibri" w:cs="Calibri" w:eastAsia="Calibri" w:hAnsi="Calibri"/>
               </w:rPr>
-              <w:t xml:space="preserve">0.9</w:t>
+              <w:t xml:space="preserve">0.8</w:t>
             </w:r>
           </w:p>
         </w:tc>
@@ -10702,7 +10860,7 @@
           <w:szCs w:val="22"/>
           <w:rFonts w:ascii="Calibri" w:cs="Calibri" w:eastAsia="Calibri" w:hAnsi="Calibri"/>
         </w:rPr>
-        <w:t xml:space="preserve">The gap is an overhead of about nine minutes rather than a proportional error: large on short pairs, gone on the longest. It is what the timetable’s best direct service does not carry — the transfer that a share of bus journeys involve, the wait for the line actually needed rather than the pooled headway of everything that passes, and delay. Only three pairs hold three or more sampled trips, so this is a trip-level comparison by distance band, not a pair-level fit. For the capture model it is the calibration margin for the bus generalized cost: either add the overhead, or replace the pooled wait by the headway of the route actually used.</w:t>
+        <w:t xml:space="preserve">The gap is an overhead of about seven minutes rather than a proportional error: large on short pairs, gone on the longest. With the running time now observed, it is what a best direct service does not carry — the transfer that a share of bus journeys involve and the wait for the line actually needed rather than the pooled headway of everything that passes. Only three pairs hold three or more sampled trips, so this is a trip-level comparison by distance band, not a pair-level fit. For the capture model it is the calibration margin for the bus generalized cost: either add the overhead, or replace the pooled wait by the headway of the route actually used.</w:t>
       </w:r>
     </w:p>
     <w:p>
@@ -10729,7 +10887,7 @@
                     </pic:cNvPicPr>
                   </pic:nvPicPr>
                   <pic:blipFill>
-                    <a:blip r:embed="rId12" cstate="none"/>
+                    <a:blip r:embed="rId13" cstate="none"/>
                     <a:srcRect/>
                     <a:stretch>
                       <a:fillRect/>
@@ -10765,7 +10923,7 @@
           <w:szCs w:val="18"/>
           <w:rFonts w:ascii="Calibri" w:cs="Calibri" w:eastAsia="Calibri" w:hAnsi="Calibri"/>
         </w:rPr>
-        <w:t xml:space="preserve">Figure 6. Bus: the timetable (direct in-vehicle time, walk and wait) against what surveyed bus users report door to door — by area pair (left, indicative) and by distance band (right).</w:t>
+        <w:t xml:space="preserve">Figure 7. Bus: the GTFS-based door-to-door time (observed in-vehicle time, walk and wait) against what surveyed bus users report — by area pair (left, indicative) and by distance band (right).</w:t>
       </w:r>
     </w:p>
     <w:p>
@@ -10790,7 +10948,7 @@
           <w:szCs w:val="22"/>
           <w:rFonts w:ascii="Calibri" w:cs="Calibri" w:eastAsia="Calibri" w:hAnsi="Calibri"/>
         </w:rPr>
-        <w:t xml:space="preserve">Revision 1 said the LRT speed was the decisive input. With the function transferred through the Red Line’s actual spacing it no longer is: the LRT’s in-vehicle time on the trunk pairs is level with the bus timetable underground and seven minutes slower at ground level. What separates the LRT from the bus in this first fill is station access, and that is a matter of the access model — feeder buses to the stations, the walking network instead of a straight-line detour factor, park-and-ride where the station plan allows — and of the station plan itself, not of the travel-time function. The two inputs to obtain first are therefore the alignment and stations beyond Hamifrats and on the three branches, without which 15 of the 25 areas have no LRT time at all, and an access treatment for the LRT. The money components (fares, parking, the value of time), missing for every mode, follow: at any plausible value of time they move the comparison by a few generalized minutes.</w:t>
+        <w:t xml:space="preserve">Revision 1 said the LRT speed was the decisive input. With the function transferred through the Red Line’s actual spacing and the bus running times observed rather than scheduled, it no longer is: the LRT’s in-vehicle time on the trunk pairs is three minutes below the buses’ observed running time underground and four minutes above it at ground level. What separates the LRT from the bus in this first fill is station access, and that is a matter of the access model — feeder buses to the stations, the walking network instead of a straight-line detour factor, park-and-ride where the station plan allows — and of the station plan itself, not of the travel-time function. The two inputs to obtain first are therefore the alignment and stations beyond Hamifrats and on the three branches, without which 15 of the 25 areas have no LRT time at all, and an access treatment for the LRT. The money components (fares, parking, the value of time), missing for every mode, follow: at any plausible value of time they move the comparison by a few generalized minutes.</w:t>
       </w:r>
     </w:p>
     <w:p>
@@ -13139,7 +13297,7 @@
                     </pic:cNvPicPr>
                   </pic:nvPicPr>
                   <pic:blipFill>
-                    <a:blip r:embed="rId13" cstate="none"/>
+                    <a:blip r:embed="rId14" cstate="none"/>
                     <a:srcRect/>
                     <a:stretch>
                       <a:fillRect/>
@@ -13175,7 +13333,7 @@
           <w:szCs w:val="18"/>
           <w:rFonts w:ascii="Calibri" w:cs="Calibri" w:eastAsia="Calibri" w:hAnsi="Calibri"/>
         </w:rPr>
-        <w:t xml:space="preserve">Figure 7. Left: bus frequency grade per TAZ on the combined peak-hour headway (Tuesday 2 June 2026, 07:00–08:00). Right: the TAZs with a Metronit stop and the Metronit stops.</w:t>
+        <w:t xml:space="preserve">Figure 8. Left: bus frequency grade per TAZ on the combined peak-hour headway (Tuesday 2 June 2026, 07:00–08:00). Right: the TAZs with a Metronit stop and the Metronit stops.</w:t>
       </w:r>
     </w:p>
     <w:p>
@@ -14099,7 +14257,7 @@
                 <w:szCs w:val="16"/>
                 <w:rFonts w:ascii="Calibri" w:cs="Calibri" w:eastAsia="Calibri" w:hAnsi="Calibri"/>
               </w:rPr>
-              <w:t xml:space="preserve">gtfs/bus_direct_skim_area_v2.csv</w:t>
+              <w:t xml:space="preserve">gtfs/bus_direct_skim_area_v2.csv, gtfs/bus_observed_skim_area_v2.csv</w:t>
             </w:r>
           </w:p>
         </w:tc>
@@ -14125,7 +14283,7 @@
                 <w:szCs w:val="16"/>
                 <w:rFonts w:ascii="Calibri" w:cs="Calibri" w:eastAsia="Calibri" w:hAnsi="Calibri"/>
               </w:rPr>
-              <w:t xml:space="preserve">Scheduled in-vehicle time, trips and headway of the direct services between the 25 areas, bus and Metronit</w:t>
+              <w:t xml:space="preserve">Scheduled and observed in-vehicle time, trips and headway of the direct services between the 25 areas, bus and Metronit</w:t>
             </w:r>
           </w:p>
         </w:tc>
@@ -14151,7 +14309,7 @@
                 <w:szCs w:val="16"/>
                 <w:rFonts w:ascii="Calibri" w:cs="Calibri" w:eastAsia="Calibri" w:hAnsi="Calibri"/>
               </w:rPr>
-              <w:t xml:space="preserve">The bus in-vehicle time, wait and transfer count of the generalized cost on the 422 pairs with a direct service</w:t>
+              <w:t xml:space="preserve">The bus in-vehicle time (observed), wait and transfer count of the generalized cost on the 422 pairs with a direct service</w:t>
             </w:r>
           </w:p>
         </w:tc>
@@ -14177,7 +14335,7 @@
                 <w:szCs w:val="16"/>
                 <w:rFonts w:ascii="Calibri" w:cs="Calibri" w:eastAsia="Calibri" w:hAnsi="Calibri"/>
               </w:rPr>
-              <w:t xml:space="preserve">Pairs without a direct service (transfer paths not built); door-to-door time without the nine-minute overhead of 5.3</w:t>
+              <w:t xml:space="preserve">Pairs without a direct service (transfer paths not built); door-to-door time without the seven-minute overhead of 5.3</w:t>
             </w:r>
           </w:p>
         </w:tc>
@@ -14707,7 +14865,7 @@
           <w:szCs w:val="22"/>
           <w:rFonts w:ascii="Calibri" w:cs="Calibri" w:eastAsia="Calibri" w:hAnsi="Calibri"/>
         </w:rPr>
-        <w:t xml:space="preserve">The bus generalized cost is the timetable’s best direct service. Bus users report nine minutes more door to door; the 178 area pairs without a direct service, eight of them on the trunk, have no transfer path yet.</w:t>
+        <w:t xml:space="preserve">The bus generalized cost is the best direct service at its observed running time. Bus users report seven minutes more door to door; the 178 area pairs without a direct service, eight of them on the trunk, have no transfer path yet. The observed times route each trip by shortest path between its stops, and 13.5 % of the hops needed link direction ignored to route plausibly.</w:t>
       </w:r>
     </w:p>
     <w:p>
@@ -14870,7 +15028,7 @@
           <w:szCs w:val="22"/>
           <w:rFonts w:ascii="Calibri" w:cs="Calibri" w:eastAsia="Calibri" w:hAnsi="Calibri"/>
         </w:rPr>
-        <w:t xml:space="preserve">The 178 area pairs without a direct service, and the wait set to the headway of the route actually used; observed (AVL) running times in place of the timetable.</w:t>
+        <w:t xml:space="preserve">The 178 area pairs without a direct service, and the wait set to the headway of the route actually used.</w:t>
       </w:r>
     </w:p>
     <w:p>
@@ -15201,7 +15359,7 @@
                 <w:szCs w:val="19"/>
                 <w:rFonts w:ascii="Calibri" w:cs="Calibri" w:eastAsia="Calibri" w:hAnsi="Calibri"/>
               </w:rPr>
-              <w:t xml:space="preserve">bus_los_taz.csv (781 TAZs, bus and Metronit metrics, grades, BRT access); bus_direct_skim_area_v2.csv (422 area pairs); dry_run/ (the synthetic mechanics test)</w:t>
+              <w:t xml:space="preserve">bus_los_taz.csv (781 TAZs, bus and Metronit metrics, grades, BRT access); bus_direct_skim_area_v2.csv (422 area pairs, scheduled); bus_observed_skim_area_v2.csv (observed), bus_segments_observed.csv, bus_trips_observed.csv.gz; the stop and stop-time intermediates; dry_run/ (the synthetic mechanics test)</w:t>
             </w:r>
           </w:p>
         </w:tc>
@@ -15363,7 +15521,7 @@
                 <w:szCs w:val="19"/>
                 <w:rFonts w:ascii="Calibri" w:cs="Calibri" w:eastAsia="Calibri" w:hAnsi="Calibri"/>
               </w:rPr>
-              <w:t xml:space="preserve">corridor_v2_route_profiles_2022.png; corridor_v2_peak_hour_profiles.png; corridor_v2_survey_vs_ticketing.png; lrt_line_profile_hf_lrt_3.png; gc_first_fill_trunk_v2.png; gc_bus_gtfs_vs_survey.png; gtfs_bus_los_taz.png</w:t>
+              <w:t xml:space="preserve">corridor_v2_route_profiles_2022.png; corridor_v2_peak_hour_profiles.png; corridor_v2_survey_vs_ticketing.png; lrt_line_profile_hf_lrt_3.png; gc_first_fill_trunk_v2.png; gtfs_bus_observed_vs_scheduled.png; gc_bus_gtfs_vs_survey.png; gtfs_bus_los_taz.png</w:t>
             </w:r>
           </w:p>
         </w:tc>
@@ -15451,7 +15609,7 @@
         <w:szCs w:val="16"/>
         <w:rFonts w:ascii="Calibri" w:cs="Calibri" w:eastAsia="Calibri" w:hAnsi="Calibri"/>
       </w:rPr>
-      <w:t xml:space="preserve">Nofit LRT Extension — V2 corridor, LRT travel times and generalized-cost inputs — revision 1.1, 22 September 2026 — page </w:t>
+      <w:t xml:space="preserve">Nofit LRT Extension — V2 corridor, LRT travel times and generalized-cost inputs — revision 1.2, 22 September 2026 — page </w:t>
     </w:r>
     <w:r>
       <w:rPr>

</xml_diff>

<commit_message>
Design-speed LRT regime (50 km/h + 10 s per stop) through the generalized cost, skims, capture and forecast capture
- Step 26: mode lrt_design_50kmh with the same access, wait and transfer
  components; step 31: skims, capture (central 3,970 trips 06-09, 19 %
  above the calibrated underground case), trunk links and boardings;
  step 32: 4,930 / 5,404 (BU) and 5,416 / 6,432 (HS) on the forecast sets
- Step 25: figure title and findings for the third scenario
- METHODOLOGY addenda (6w, 6x, 6ac, 6ad, section 0 row), README, capture
  plan row; report rebuilt with the third scenario in Part B and Part E

Co-Authored-By: Claude Fable 5.1 <noreply@anthropic.com>
Claude-Session: https://claude.ai/code/session_0138kj3xGsp2dcZMES5hKCoY
</commit_message>
<xml_diff>
--- a/reports/V2_Corridor_LRT_Times_and_GC_Inputs_Report.docx
+++ b/reports/V2_Corridor_LRT_Times_and_GC_Inputs_Report.docx
@@ -5593,6 +5593,19 @@
     </w:tbl>
     <w:p>
       <w:pPr>
+        <w:spacing w:after="120" w:before="0"/>
+      </w:pPr>
+      <w:r>
+        <w:rPr>
+          <w:sz w:val="22"/>
+          <w:szCs w:val="22"/>
+          <w:rFonts w:ascii="Calibri" w:cs="Calibri" w:eastAsia="Calibri" w:hAnsi="Calibri"/>
+        </w:rPr>
+        <w:t xml:space="preserve">A third scenario was added at the study team’s request: a specified design regime of 50 km/h between stops with 10 seconds per stop, at the same 5-minute headway. It runs end to end in 26.3 minutes (42.7 km/h), 35 % below the calibrated underground case, because the specification carries no acceleration or braking — the calibrated forms put 49 to 74 seconds per stop into the stop penalty, where dwell, acceleration and deceleration all sit. It should be read as the ceiling of the alignment, beside the two calibrated scenarios rather than as a third observed regime.</w:t>
+      </w:r>
+    </w:p>
+    <w:p>
+      <w:pPr>
         <w:spacing w:after="120"/>
       </w:pPr>
     </w:p>
@@ -5935,6 +5948,112 @@
                 <w:rFonts w:ascii="Calibri" w:cs="Calibri" w:eastAsia="Calibri" w:hAnsi="Calibri"/>
               </w:rPr>
               <w:t xml:space="preserve">89.7 min (12.5 km/h)</w:t>
+            </w:r>
+          </w:p>
+        </w:tc>
+      </w:tr>
+      <w:tr>
+        <w:tc>
+          <w:tcPr>
+            <w:tcW w:type="dxa" w:w="2160"/>
+            <w:tcMar>
+              <w:top w:type="dxa" w:w="40"/>
+              <w:left w:type="dxa" w:w="80"/>
+              <w:bottom w:type="dxa" w:w="40"/>
+              <w:right w:type="dxa" w:w="80"/>
+            </w:tcMar>
+          </w:tcPr>
+          <w:p>
+            <w:pPr>
+              <w:spacing w:after="0"/>
+            </w:pPr>
+            <w:r>
+              <w:rPr>
+                <w:b w:val="false"/>
+                <w:bCs w:val="false"/>
+                <w:sz w:val="19"/>
+                <w:szCs w:val="19"/>
+                <w:rFonts w:ascii="Calibri" w:cs="Calibri" w:eastAsia="Calibri" w:hAnsi="Calibri"/>
+              </w:rPr>
+              <w:t xml:space="preserve">Specified design regime: 50 km/h + 10 s per stop (third scenario)</w:t>
+            </w:r>
+          </w:p>
+        </w:tc>
+        <w:tc>
+          <w:tcPr>
+            <w:tcW w:type="dxa" w:w="2700"/>
+            <w:tcMar>
+              <w:top w:type="dxa" w:w="40"/>
+              <w:left w:type="dxa" w:w="80"/>
+              <w:bottom w:type="dxa" w:w="40"/>
+              <w:right w:type="dxa" w:w="80"/>
+            </w:tcMar>
+          </w:tcPr>
+          <w:p>
+            <w:pPr>
+              <w:spacing w:after="0"/>
+            </w:pPr>
+            <w:r>
+              <w:rPr>
+                <w:b w:val="false"/>
+                <w:bCs w:val="false"/>
+                <w:sz w:val="19"/>
+                <w:szCs w:val="19"/>
+                <w:rFonts w:ascii="Calibri" w:cs="Calibri" w:eastAsia="Calibri" w:hAnsi="Calibri"/>
+              </w:rPr>
+              <w:t xml:space="preserve">26.3 min (42.7 km/h)</w:t>
+            </w:r>
+          </w:p>
+        </w:tc>
+        <w:tc>
+          <w:tcPr>
+            <w:tcW w:type="dxa" w:w="2160"/>
+            <w:tcMar>
+              <w:top w:type="dxa" w:w="40"/>
+              <w:left w:type="dxa" w:w="80"/>
+              <w:bottom w:type="dxa" w:w="40"/>
+              <w:right w:type="dxa" w:w="80"/>
+            </w:tcMar>
+          </w:tcPr>
+          <w:p>
+            <w:pPr>
+              <w:spacing w:after="0"/>
+            </w:pPr>
+            <w:r>
+              <w:rPr>
+                <w:b w:val="false"/>
+                <w:bCs w:val="false"/>
+                <w:sz w:val="19"/>
+                <w:szCs w:val="19"/>
+                <w:rFonts w:ascii="Calibri" w:cs="Calibri" w:eastAsia="Calibri" w:hAnsi="Calibri"/>
+              </w:rPr>
+              <w:t xml:space="preserve">—</w:t>
+            </w:r>
+          </w:p>
+        </w:tc>
+        <w:tc>
+          <w:tcPr>
+            <w:tcW w:type="dxa" w:w="1980"/>
+            <w:tcMar>
+              <w:top w:type="dxa" w:w="40"/>
+              <w:left w:type="dxa" w:w="80"/>
+              <w:bottom w:type="dxa" w:w="40"/>
+              <w:right w:type="dxa" w:w="80"/>
+            </w:tcMar>
+          </w:tcPr>
+          <w:p>
+            <w:pPr>
+              <w:spacing w:after="0"/>
+            </w:pPr>
+            <w:r>
+              <w:rPr>
+                <w:b w:val="false"/>
+                <w:bCs w:val="false"/>
+                <w:sz w:val="19"/>
+                <w:szCs w:val="19"/>
+                <w:rFonts w:ascii="Calibri" w:cs="Calibri" w:eastAsia="Calibri" w:hAnsi="Calibri"/>
+              </w:rPr>
+              <w:t xml:space="preserve">—</w:t>
             </w:r>
           </w:p>
         </w:tc>
@@ -6072,7 +6191,7 @@
       <w:r>
         <w:drawing>
           <wp:inline distT="0" distB="0" distL="0" distR="0">
-            <wp:extent cx="5810250" cy="2457450"/>
+            <wp:extent cx="5810250" cy="2438400"/>
             <wp:effectExtent t="0" r="0" b="0" l="0"/>
             <wp:docPr id="1" name="" descr="" title=""/>
             <wp:cNvGraphicFramePr>
@@ -6097,7 +6216,7 @@
                   <pic:spPr bwMode="auto">
                     <a:xfrm>
                       <a:off x="0" y="0"/>
-                      <a:ext cx="5810250" cy="2457450"/>
+                      <a:ext cx="5810250" cy="2438400"/>
                     </a:xfrm>
                     <a:prstGeom prst="rect">
                       <a:avLst/>
@@ -14531,6 +14650,190 @@
           </w:p>
         </w:tc>
       </w:tr>
+      <w:tr>
+        <w:tc>
+          <w:tcPr>
+            <w:tcW w:type="dxa" w:w="2020"/>
+            <w:tcMar>
+              <w:top w:type="dxa" w:w="40"/>
+              <w:left w:type="dxa" w:w="80"/>
+              <w:bottom w:type="dxa" w:w="40"/>
+              <w:right w:type="dxa" w:w="80"/>
+            </w:tcMar>
+          </w:tcPr>
+          <w:p>
+            <w:pPr>
+              <w:spacing w:after="0"/>
+            </w:pPr>
+            <w:r>
+              <w:rPr>
+                <w:b w:val="false"/>
+                <w:bCs w:val="false"/>
+                <w:sz w:val="17"/>
+                <w:szCs w:val="17"/>
+                <w:rFonts w:ascii="Calibri" w:cs="Calibri" w:eastAsia="Calibri" w:hAnsi="Calibri"/>
+              </w:rPr>
+              <w:t xml:space="preserve">LRT design 50 km/h + 10 s (specified)</w:t>
+            </w:r>
+          </w:p>
+        </w:tc>
+        <w:tc>
+          <w:tcPr>
+            <w:tcW w:type="dxa" w:w="1194"/>
+            <w:tcMar>
+              <w:top w:type="dxa" w:w="40"/>
+              <w:left w:type="dxa" w:w="80"/>
+              <w:bottom w:type="dxa" w:w="40"/>
+              <w:right w:type="dxa" w:w="80"/>
+            </w:tcMar>
+          </w:tcPr>
+          <w:p>
+            <w:pPr>
+              <w:spacing w:after="0"/>
+            </w:pPr>
+            <w:r>
+              <w:rPr>
+                <w:b w:val="false"/>
+                <w:bCs w:val="false"/>
+                <w:sz w:val="17"/>
+                <w:szCs w:val="17"/>
+                <w:rFonts w:ascii="Calibri" w:cs="Calibri" w:eastAsia="Calibri" w:hAnsi="Calibri"/>
+              </w:rPr>
+              <w:t xml:space="preserve">600</w:t>
+            </w:r>
+          </w:p>
+        </w:tc>
+        <w:tc>
+          <w:tcPr>
+            <w:tcW w:type="dxa" w:w="1378"/>
+            <w:tcMar>
+              <w:top w:type="dxa" w:w="40"/>
+              <w:left w:type="dxa" w:w="80"/>
+              <w:bottom w:type="dxa" w:w="40"/>
+              <w:right w:type="dxa" w:w="80"/>
+            </w:tcMar>
+          </w:tcPr>
+          <w:p>
+            <w:pPr>
+              <w:spacing w:after="0"/>
+            </w:pPr>
+            <w:r>
+              <w:rPr>
+                <w:b w:val="false"/>
+                <w:bCs w:val="false"/>
+                <w:sz w:val="17"/>
+                <w:szCs w:val="17"/>
+                <w:rFonts w:ascii="Calibri" w:cs="Calibri" w:eastAsia="Calibri" w:hAnsi="Calibri"/>
+              </w:rPr>
+              <w:t xml:space="preserve">8.0</w:t>
+            </w:r>
+          </w:p>
+        </w:tc>
+        <w:tc>
+          <w:tcPr>
+            <w:tcW w:type="dxa" w:w="918"/>
+            <w:tcMar>
+              <w:top w:type="dxa" w:w="40"/>
+              <w:left w:type="dxa" w:w="80"/>
+              <w:bottom w:type="dxa" w:w="40"/>
+              <w:right w:type="dxa" w:w="80"/>
+            </w:tcMar>
+          </w:tcPr>
+          <w:p>
+            <w:pPr>
+              <w:spacing w:after="0"/>
+            </w:pPr>
+            <w:r>
+              <w:rPr>
+                <w:b w:val="false"/>
+                <w:bCs w:val="false"/>
+                <w:sz w:val="17"/>
+                <w:szCs w:val="17"/>
+                <w:rFonts w:ascii="Calibri" w:cs="Calibri" w:eastAsia="Calibri" w:hAnsi="Calibri"/>
+              </w:rPr>
+              <w:t xml:space="preserve">13.2</w:t>
+            </w:r>
+          </w:p>
+        </w:tc>
+        <w:tc>
+          <w:tcPr>
+            <w:tcW w:type="dxa" w:w="918"/>
+            <w:tcMar>
+              <w:top w:type="dxa" w:w="40"/>
+              <w:left w:type="dxa" w:w="80"/>
+              <w:bottom w:type="dxa" w:w="40"/>
+              <w:right w:type="dxa" w:w="80"/>
+            </w:tcMar>
+          </w:tcPr>
+          <w:p>
+            <w:pPr>
+              <w:spacing w:after="0"/>
+            </w:pPr>
+            <w:r>
+              <w:rPr>
+                <w:b w:val="false"/>
+                <w:bCs w:val="false"/>
+                <w:sz w:val="17"/>
+                <w:szCs w:val="17"/>
+                <w:rFonts w:ascii="Calibri" w:cs="Calibri" w:eastAsia="Calibri" w:hAnsi="Calibri"/>
+              </w:rPr>
+              <w:t xml:space="preserve">2.5</w:t>
+            </w:r>
+          </w:p>
+        </w:tc>
+        <w:tc>
+          <w:tcPr>
+            <w:tcW w:type="dxa" w:w="1102"/>
+            <w:tcMar>
+              <w:top w:type="dxa" w:w="40"/>
+              <w:left w:type="dxa" w:w="80"/>
+              <w:bottom w:type="dxa" w:w="40"/>
+              <w:right w:type="dxa" w:w="80"/>
+            </w:tcMar>
+          </w:tcPr>
+          <w:p>
+            <w:pPr>
+              <w:spacing w:after="0"/>
+            </w:pPr>
+            <w:r>
+              <w:rPr>
+                <w:b w:val="false"/>
+                <w:bCs w:val="false"/>
+                <w:sz w:val="17"/>
+                <w:szCs w:val="17"/>
+                <w:rFonts w:ascii="Calibri" w:cs="Calibri" w:eastAsia="Calibri" w:hAnsi="Calibri"/>
+              </w:rPr>
+              <w:t xml:space="preserve">39.4</w:t>
+            </w:r>
+          </w:p>
+        </w:tc>
+        <w:tc>
+          <w:tcPr>
+            <w:tcW w:type="dxa" w:w="1469"/>
+            <w:tcMar>
+              <w:top w:type="dxa" w:w="40"/>
+              <w:left w:type="dxa" w:w="80"/>
+              <w:bottom w:type="dxa" w:w="40"/>
+              <w:right w:type="dxa" w:w="80"/>
+            </w:tcMar>
+          </w:tcPr>
+          <w:p>
+            <w:pPr>
+              <w:spacing w:after="0"/>
+            </w:pPr>
+            <w:r>
+              <w:rPr>
+                <w:b w:val="false"/>
+                <w:bCs w:val="false"/>
+                <w:sz w:val="17"/>
+                <w:szCs w:val="17"/>
+                <w:rFonts w:ascii="Calibri" w:cs="Calibri" w:eastAsia="Calibri" w:hAnsi="Calibri"/>
+              </w:rPr>
+              <w:t xml:space="preserve">61.1</w:t>
+            </w:r>
+          </w:p>
+        </w:tc>
+      </w:tr>
     </w:tbl>
     <w:p>
       <w:pPr>
@@ -15801,6 +16104,320 @@
           </w:p>
         </w:tc>
       </w:tr>
+      <w:tr>
+        <w:tc>
+          <w:tcPr>
+            <w:tcW w:type="dxa" w:w="3122"/>
+            <w:tcMar>
+              <w:top w:type="dxa" w:w="40"/>
+              <w:left w:type="dxa" w:w="80"/>
+              <w:bottom w:type="dxa" w:w="40"/>
+              <w:right w:type="dxa" w:w="80"/>
+            </w:tcMar>
+          </w:tcPr>
+          <w:p>
+            <w:pPr>
+              <w:spacing w:after="0"/>
+            </w:pPr>
+            <w:r>
+              <w:rPr>
+                <w:b w:val="false"/>
+                <w:bCs w:val="false"/>
+                <w:sz w:val="17"/>
+                <w:szCs w:val="17"/>
+                <w:rFonts w:ascii="Calibri" w:cs="Calibri" w:eastAsia="Calibri" w:hAnsi="Calibri"/>
+              </w:rPr>
+              <w:t xml:space="preserve">Design 50 km/h + 10 s, central</w:t>
+            </w:r>
+          </w:p>
+        </w:tc>
+        <w:tc>
+          <w:tcPr>
+            <w:tcW w:type="dxa" w:w="1469"/>
+            <w:tcMar>
+              <w:top w:type="dxa" w:w="40"/>
+              <w:left w:type="dxa" w:w="80"/>
+              <w:bottom w:type="dxa" w:w="40"/>
+              <w:right w:type="dxa" w:w="80"/>
+            </w:tcMar>
+          </w:tcPr>
+          <w:p>
+            <w:pPr>
+              <w:spacing w:after="0"/>
+            </w:pPr>
+            <w:r>
+              <w:rPr>
+                <w:b w:val="false"/>
+                <w:bCs w:val="false"/>
+                <w:sz w:val="17"/>
+                <w:szCs w:val="17"/>
+                <w:rFonts w:ascii="Calibri" w:cs="Calibri" w:eastAsia="Calibri" w:hAnsi="Calibri"/>
+              </w:rPr>
+              <w:t xml:space="preserve">3,970</w:t>
+            </w:r>
+          </w:p>
+        </w:tc>
+        <w:tc>
+          <w:tcPr>
+            <w:tcW w:type="dxa" w:w="918"/>
+            <w:tcMar>
+              <w:top w:type="dxa" w:w="40"/>
+              <w:left w:type="dxa" w:w="80"/>
+              <w:bottom w:type="dxa" w:w="40"/>
+              <w:right w:type="dxa" w:w="80"/>
+            </w:tcMar>
+          </w:tcPr>
+          <w:p>
+            <w:pPr>
+              <w:spacing w:after="0"/>
+            </w:pPr>
+            <w:r>
+              <w:rPr>
+                <w:b w:val="false"/>
+                <w:bCs w:val="false"/>
+                <w:sz w:val="17"/>
+                <w:szCs w:val="17"/>
+                <w:rFonts w:ascii="Calibri" w:cs="Calibri" w:eastAsia="Calibri" w:hAnsi="Calibri"/>
+              </w:rPr>
+              <w:t xml:space="preserve">3,534</w:t>
+            </w:r>
+          </w:p>
+        </w:tc>
+        <w:tc>
+          <w:tcPr>
+            <w:tcW w:type="dxa" w:w="918"/>
+            <w:tcMar>
+              <w:top w:type="dxa" w:w="40"/>
+              <w:left w:type="dxa" w:w="80"/>
+              <w:bottom w:type="dxa" w:w="40"/>
+              <w:right w:type="dxa" w:w="80"/>
+            </w:tcMar>
+          </w:tcPr>
+          <w:p>
+            <w:pPr>
+              <w:spacing w:after="0"/>
+            </w:pPr>
+            <w:r>
+              <w:rPr>
+                <w:b w:val="false"/>
+                <w:bCs w:val="false"/>
+                <w:sz w:val="17"/>
+                <w:szCs w:val="17"/>
+                <w:rFonts w:ascii="Calibri" w:cs="Calibri" w:eastAsia="Calibri" w:hAnsi="Calibri"/>
+              </w:rPr>
+              <w:t xml:space="preserve">437</w:t>
+            </w:r>
+          </w:p>
+        </w:tc>
+        <w:tc>
+          <w:tcPr>
+            <w:tcW w:type="dxa" w:w="1194"/>
+            <w:tcMar>
+              <w:top w:type="dxa" w:w="40"/>
+              <w:left w:type="dxa" w:w="80"/>
+              <w:bottom w:type="dxa" w:w="40"/>
+              <w:right w:type="dxa" w:w="80"/>
+            </w:tcMar>
+          </w:tcPr>
+          <w:p>
+            <w:pPr>
+              <w:spacing w:after="0"/>
+            </w:pPr>
+            <w:r>
+              <w:rPr>
+                <w:b w:val="false"/>
+                <w:bCs w:val="false"/>
+                <w:sz w:val="17"/>
+                <w:szCs w:val="17"/>
+                <w:rFonts w:ascii="Calibri" w:cs="Calibri" w:eastAsia="Calibri" w:hAnsi="Calibri"/>
+              </w:rPr>
+              <w:t xml:space="preserve">31 %</w:t>
+            </w:r>
+          </w:p>
+        </w:tc>
+        <w:tc>
+          <w:tcPr>
+            <w:tcW w:type="dxa" w:w="1378"/>
+            <w:tcMar>
+              <w:top w:type="dxa" w:w="40"/>
+              <w:left w:type="dxa" w:w="80"/>
+              <w:bottom w:type="dxa" w:w="40"/>
+              <w:right w:type="dxa" w:w="80"/>
+            </w:tcMar>
+          </w:tcPr>
+          <w:p>
+            <w:pPr>
+              <w:spacing w:after="0"/>
+            </w:pPr>
+            <w:r>
+              <w:rPr>
+                <w:b w:val="false"/>
+                <w:bCs w:val="false"/>
+                <w:sz w:val="17"/>
+                <w:szCs w:val="17"/>
+                <w:rFonts w:ascii="Calibri" w:cs="Calibri" w:eastAsia="Calibri" w:hAnsi="Calibri"/>
+              </w:rPr>
+              <w:t xml:space="preserve">40 %</w:t>
+            </w:r>
+          </w:p>
+        </w:tc>
+      </w:tr>
+      <w:tr>
+        <w:tc>
+          <w:tcPr>
+            <w:tcW w:type="dxa" w:w="3122"/>
+            <w:tcMar>
+              <w:top w:type="dxa" w:w="40"/>
+              <w:left w:type="dxa" w:w="80"/>
+              <w:bottom w:type="dxa" w:w="40"/>
+              <w:right w:type="dxa" w:w="80"/>
+            </w:tcMar>
+          </w:tcPr>
+          <w:p>
+            <w:pPr>
+              <w:spacing w:after="0"/>
+            </w:pPr>
+            <w:r>
+              <w:rPr>
+                <w:b w:val="false"/>
+                <w:bCs w:val="false"/>
+                <w:sz w:val="17"/>
+                <w:szCs w:val="17"/>
+                <w:rFonts w:ascii="Calibri" w:cs="Calibri" w:eastAsia="Calibri" w:hAnsi="Calibri"/>
+              </w:rPr>
+              <w:t xml:space="preserve">Design 50 km/h + 10 s, λ 0.02 / 0.05</w:t>
+            </w:r>
+          </w:p>
+        </w:tc>
+        <w:tc>
+          <w:tcPr>
+            <w:tcW w:type="dxa" w:w="1469"/>
+            <w:tcMar>
+              <w:top w:type="dxa" w:w="40"/>
+              <w:left w:type="dxa" w:w="80"/>
+              <w:bottom w:type="dxa" w:w="40"/>
+              <w:right w:type="dxa" w:w="80"/>
+            </w:tcMar>
+          </w:tcPr>
+          <w:p>
+            <w:pPr>
+              <w:spacing w:after="0"/>
+            </w:pPr>
+            <w:r>
+              <w:rPr>
+                <w:b w:val="false"/>
+                <w:bCs w:val="false"/>
+                <w:sz w:val="17"/>
+                <w:szCs w:val="17"/>
+                <w:rFonts w:ascii="Calibri" w:cs="Calibri" w:eastAsia="Calibri" w:hAnsi="Calibri"/>
+              </w:rPr>
+              <w:t xml:space="preserve">5,272 / 3,227</w:t>
+            </w:r>
+          </w:p>
+        </w:tc>
+        <w:tc>
+          <w:tcPr>
+            <w:tcW w:type="dxa" w:w="918"/>
+            <w:tcMar>
+              <w:top w:type="dxa" w:w="40"/>
+              <w:left w:type="dxa" w:w="80"/>
+              <w:bottom w:type="dxa" w:w="40"/>
+              <w:right w:type="dxa" w:w="80"/>
+            </w:tcMar>
+          </w:tcPr>
+          <w:p>
+            <w:pPr>
+              <w:spacing w:after="0"/>
+            </w:pPr>
+            <w:r>
+              <w:rPr>
+                <w:b w:val="false"/>
+                <w:bCs w:val="false"/>
+                <w:sz w:val="17"/>
+                <w:szCs w:val="17"/>
+                <w:rFonts w:ascii="Calibri" w:cs="Calibri" w:eastAsia="Calibri" w:hAnsi="Calibri"/>
+              </w:rPr>
+            </w:r>
+          </w:p>
+        </w:tc>
+        <w:tc>
+          <w:tcPr>
+            <w:tcW w:type="dxa" w:w="918"/>
+            <w:tcMar>
+              <w:top w:type="dxa" w:w="40"/>
+              <w:left w:type="dxa" w:w="80"/>
+              <w:bottom w:type="dxa" w:w="40"/>
+              <w:right w:type="dxa" w:w="80"/>
+            </w:tcMar>
+          </w:tcPr>
+          <w:p>
+            <w:pPr>
+              <w:spacing w:after="0"/>
+            </w:pPr>
+            <w:r>
+              <w:rPr>
+                <w:b w:val="false"/>
+                <w:bCs w:val="false"/>
+                <w:sz w:val="17"/>
+                <w:szCs w:val="17"/>
+                <w:rFonts w:ascii="Calibri" w:cs="Calibri" w:eastAsia="Calibri" w:hAnsi="Calibri"/>
+              </w:rPr>
+            </w:r>
+          </w:p>
+        </w:tc>
+        <w:tc>
+          <w:tcPr>
+            <w:tcW w:type="dxa" w:w="1194"/>
+            <w:tcMar>
+              <w:top w:type="dxa" w:w="40"/>
+              <w:left w:type="dxa" w:w="80"/>
+              <w:bottom w:type="dxa" w:w="40"/>
+              <w:right w:type="dxa" w:w="80"/>
+            </w:tcMar>
+          </w:tcPr>
+          <w:p>
+            <w:pPr>
+              <w:spacing w:after="0"/>
+            </w:pPr>
+            <w:r>
+              <w:rPr>
+                <w:b w:val="false"/>
+                <w:bCs w:val="false"/>
+                <w:sz w:val="17"/>
+                <w:szCs w:val="17"/>
+                <w:rFonts w:ascii="Calibri" w:cs="Calibri" w:eastAsia="Calibri" w:hAnsi="Calibri"/>
+              </w:rPr>
+              <w:t xml:space="preserve">38 % / 26 %</w:t>
+            </w:r>
+          </w:p>
+        </w:tc>
+        <w:tc>
+          <w:tcPr>
+            <w:tcW w:type="dxa" w:w="1378"/>
+            <w:tcMar>
+              <w:top w:type="dxa" w:w="40"/>
+              <w:left w:type="dxa" w:w="80"/>
+              <w:bottom w:type="dxa" w:w="40"/>
+              <w:right w:type="dxa" w:w="80"/>
+            </w:tcMar>
+          </w:tcPr>
+          <w:p>
+            <w:pPr>
+              <w:spacing w:after="0"/>
+            </w:pPr>
+            <w:r>
+              <w:rPr>
+                <w:b w:val="false"/>
+                <w:bCs w:val="false"/>
+                <w:sz w:val="17"/>
+                <w:szCs w:val="17"/>
+                <w:rFonts w:ascii="Calibri" w:cs="Calibri" w:eastAsia="Calibri" w:hAnsi="Calibri"/>
+              </w:rPr>
+              <w:t xml:space="preserve">45 % / 35 %</w:t>
+            </w:r>
+          </w:p>
+        </w:tc>
+      </w:tr>
     </w:tbl>
     <w:p>
       <w:pPr>
@@ -15812,7 +16429,7 @@
           <w:szCs w:val="22"/>
           <w:rFonts w:ascii="Calibri" w:cs="Calibri" w:eastAsia="Calibri" w:hAnsi="Calibri"/>
         </w:rPr>
-        <w:t xml:space="preserve">Two of the three assumptions each add about a fifth to the central figure: without the premium the underground line takes 2,658 trips, some 400 of which the free Metronit transfer brings in from the Krayot; with a ten-minute premium 4,122. The range across the cost sensitivity, 2,357 to 4,855, is wider than the difference between the two alignments. The trips board mostly at the two Krayot-facing ends — Hamifrats 995 and Namal-Giborim 747, where the Metronit feeders arrive — then Hecht-Shprintzak 391 and Bat Galim 353; the largest single flows run to the Matam employment end from Bat Galim (122), Hecht-Shprintzak (116) and Tirat Carmel (104), then Nazareth to the Lower City (75) by feeder bus.</w:t>
+        <w:t xml:space="preserve">Two of the three assumptions each add about a fifth to the central figure: without the premium the underground line takes 2,658 trips, some 400 of which the free Metronit transfer brings in from the Krayot; with a ten-minute premium 4,122. The range across the cost sensitivity, 2,357 to 4,855, is wider than the difference between the two alignments. In the specified design regime the line draws 3,970 trips, a fifth more than underground — what the ceiling of the alignment is worth, and less than the range across λ. The trips board mostly at the two Krayot-facing ends — Hamifrats 995 and Namal-Giborim 747, where the Metronit feeders arrive — then Hecht-Shprintzak 391 and Bat Galim 353; the largest single flows run to the Matam employment end from Bat Galim (122), Hecht-Shprintzak (116) and Tirat Carmel (104), then Nazareth to the Lower City (75) by feeder bus.</w:t>
       </w:r>
     </w:p>
     <w:p>
@@ -15913,7 +16530,7 @@
           <w:szCs w:val="22"/>
           <w:rFonts w:ascii="Calibri" w:cs="Calibri" w:eastAsia="Calibri" w:hAnsi="Calibri"/>
         </w:rPr>
-        <w:t xml:space="preserve">With the zonal forecast files pulled, the four demographic-reference sets of the forecast step (BU and HS, 2040 and 2050) were produced at TAZ level and aggregated to the 25 areas: transit trips between the areas grow from 11,664 to 14,836 and 16,369 under BU and to 16,076 and 18,291 under HS, car trips a little faster, so the no-build transit share stays at 0.16–0.17 by construction. The capture applied to them, with the skims held at today’s conditions, gives 4,114 and 4,498 LRT trips underground under BU and 4,520 and 5,354 under HS (ground level 3,105 / 3,386 and 3,430 / 4,047): the capture rate is the same as in 2022 — 28 to 29 % of the transit trips underground — because nothing in the skims changes with the year; what changes is the market and where it grows. BU grows Tirat Carmel and the Krayot branch, HS the Carmel coast (Matam, Hof Carmel, Bat Galim) and the western Krayot, and the boardings follow: Hamifrats stays the largest station area in every scenario (995 today, 1,717 by HS 2050), Tirat Carmel more than doubles under BU, Bat Galim and Matam under HS. The busiest trunk link, Namal-Giborim to Hamifrats towards the Krayot, goes from 995 trips in the three hours today to 1,367 (BU 2050) and 1,717 (HS 2050) — about 1,000 in the peak hour by HS 2050.</w:t>
+        <w:t xml:space="preserve">With the zonal forecast files pulled, the four demographic-reference sets of the forecast step (BU and HS, 2040 and 2050) were produced at TAZ level and aggregated to the 25 areas: transit trips between the areas grow from 11,664 to 14,836 and 16,369 under BU and to 16,076 and 18,291 under HS, car trips a little faster, so the no-build transit share stays at 0.16–0.17 by construction. The capture applied to them, with the skims held at today’s conditions, gives 4,114 and 4,498 LRT trips underground under BU and 4,520 and 5,354 under HS (ground level 3,105 / 3,386 and 3,430 / 4,047): the capture rate is the same as in 2022 — 28 to 29 % of the transit trips underground — because nothing in the skims changes with the year; what changes is the market and where it grows. BU grows Tirat Carmel and the Krayot branch, HS the Carmel coast (Matam, Hof Carmel, Bat Galim) and the western Krayot, and the boardings follow: Hamifrats stays the largest station area in every scenario (995 today, 1,717 by HS 2050), Tirat Carmel more than doubles under BU, Bat Galim and Matam under HS. The busiest trunk link, Namal-Giborim to Hamifrats towards the Krayot, goes from 995 trips in the three hours today to 1,367 (BU 2050) and 1,717 (HS 2050) — about 1,000 in the peak hour by HS 2050; in the design regime 6,432 trips by HS 2050 and 2,104 on that link, about 1,250 in the peak hour.</w:t>
       </w:r>
     </w:p>
     <w:p>
@@ -16625,7 +17242,7 @@
                 <w:szCs w:val="16"/>
                 <w:rFonts w:ascii="Calibri" w:cs="Calibri" w:eastAsia="Calibri" w:hAnsi="Calibri"/>
               </w:rPr>
-              <w:t xml:space="preserve">lrt_v2/lrt_station_times_{all_underground, all_ground}.csv (+ …_section_form, …_nominal500m_form)</w:t>
+              <w:t xml:space="preserve">lrt_v2/lrt_station_times_{all_underground, all_ground, design_50kmh}.csv (+ …_section_form, …_nominal500m_form)</w:t>
             </w:r>
           </w:p>
         </w:tc>

</xml_diff>